<commit_message>
Module 4 complete, added dataset and rmarkdown template.
</commit_message>
<xml_diff>
--- a/docs/module03.docx
+++ b/docs/module03.docx
@@ -1040,7 +1040,7 @@
                     <a:graphicData uri="http://schemas.openxmlformats.org/drawingml/2006/picture">
                       <pic:pic>
                         <pic:nvPicPr>
-                          <pic:cNvPr descr="C:\Program Files\RStudio\resources\app\bin\quarto\share\formats\docx\important.png" id="32" name="Picture"/>
+                          <pic:cNvPr descr="C:\PROGRA~1\RStudio\RESOUR~1\app\bin\quarto\share\formats\docx\important.png" id="32" name="Picture"/>
                           <pic:cNvPicPr>
                             <a:picLocks noChangeArrowheads="1" noChangeAspect="1"/>
                           </pic:cNvPicPr>
@@ -3008,7 +3008,7 @@
                     <a:graphicData uri="http://schemas.openxmlformats.org/drawingml/2006/picture">
                       <pic:pic>
                         <pic:nvPicPr>
-                          <pic:cNvPr descr="C:\Program Files\RStudio\resources\app\bin\quarto\share\formats\docx\warning.png" id="40" name="Picture"/>
+                          <pic:cNvPr descr="C:\PROGRA~1\RStudio\RESOUR~1\app\bin\quarto\share\formats\docx\warning.png" id="40" name="Picture"/>
                           <pic:cNvPicPr>
                             <a:picLocks noChangeArrowheads="1" noChangeAspect="1"/>
                           </pic:cNvPicPr>
@@ -3490,7 +3490,7 @@
                     <a:graphicData uri="http://schemas.openxmlformats.org/drawingml/2006/picture">
                       <pic:pic>
                         <pic:nvPicPr>
-                          <pic:cNvPr descr="C:\Program Files\RStudio\resources\app\bin\quarto\share\formats\docx\note.png" id="47" name="Picture"/>
+                          <pic:cNvPr descr="C:\PROGRA~1\RStudio\RESOUR~1\app\bin\quarto\share\formats\docx\note.png" id="47" name="Picture"/>
                           <pic:cNvPicPr>
                             <a:picLocks noChangeArrowheads="1" noChangeAspect="1"/>
                           </pic:cNvPicPr>
@@ -4201,7 +4201,7 @@
                     <a:graphicData uri="http://schemas.openxmlformats.org/drawingml/2006/picture">
                       <pic:pic>
                         <pic:nvPicPr>
-                          <pic:cNvPr descr="C:\Program Files\RStudio\resources\app\bin\quarto\share\formats\docx\warning.png" id="54" name="Picture"/>
+                          <pic:cNvPr descr="C:\PROGRA~1\RStudio\RESOUR~1\app\bin\quarto\share\formats\docx\warning.png" id="54" name="Picture"/>
                           <pic:cNvPicPr>
                             <a:picLocks noChangeArrowheads="1" noChangeAspect="1"/>
                           </pic:cNvPicPr>
@@ -4568,7 +4568,7 @@
                     <a:graphicData uri="http://schemas.openxmlformats.org/drawingml/2006/picture">
                       <pic:pic>
                         <pic:nvPicPr>
-                          <pic:cNvPr descr="C:\Program Files\RStudio\resources\app\bin\quarto\share\formats\docx\warning.png" id="57" name="Picture"/>
+                          <pic:cNvPr descr="C:\PROGRA~1\RStudio\RESOUR~1\app\bin\quarto\share\formats\docx\warning.png" id="57" name="Picture"/>
                           <pic:cNvPicPr>
                             <a:picLocks noChangeArrowheads="1" noChangeAspect="1"/>
                           </pic:cNvPicPr>
@@ -7884,7 +7884,7 @@
                     <a:graphicData uri="http://schemas.openxmlformats.org/drawingml/2006/picture">
                       <pic:pic>
                         <pic:nvPicPr>
-                          <pic:cNvPr descr="C:\Program Files\RStudio\resources\app\bin\quarto\share\formats\docx\note.png" id="70" name="Picture"/>
+                          <pic:cNvPr descr="C:\PROGRA~1\RStudio\RESOUR~1\app\bin\quarto\share\formats\docx\note.png" id="70" name="Picture"/>
                           <pic:cNvPicPr>
                             <a:picLocks noChangeArrowheads="1" noChangeAspect="1"/>
                           </pic:cNvPicPr>
@@ -8779,7 +8779,7 @@
                     <a:graphicData uri="http://schemas.openxmlformats.org/drawingml/2006/picture">
                       <pic:pic>
                         <pic:nvPicPr>
-                          <pic:cNvPr descr="C:\Program Files\RStudio\resources\app\bin\quarto\share\formats\docx\note.png" id="73" name="Picture"/>
+                          <pic:cNvPr descr="C:\PROGRA~1\RStudio\RESOUR~1\app\bin\quarto\share\formats\docx\note.png" id="73" name="Picture"/>
                           <pic:cNvPicPr>
                             <a:picLocks noChangeArrowheads="1" noChangeAspect="1"/>
                           </pic:cNvPicPr>
@@ -9797,7 +9797,7 @@
                     <a:graphicData uri="http://schemas.openxmlformats.org/drawingml/2006/picture">
                       <pic:pic>
                         <pic:nvPicPr>
-                          <pic:cNvPr descr="C:\Program Files\RStudio\resources\app\bin\quarto\share\formats\docx\note.png" id="83" name="Picture"/>
+                          <pic:cNvPr descr="C:\PROGRA~1\RStudio\RESOUR~1\app\bin\quarto\share\formats\docx\note.png" id="83" name="Picture"/>
                           <pic:cNvPicPr>
                             <a:picLocks noChangeArrowheads="1" noChangeAspect="1"/>
                           </pic:cNvPicPr>
@@ -10480,7 +10480,7 @@
                     <a:graphicData uri="http://schemas.openxmlformats.org/drawingml/2006/picture">
                       <pic:pic>
                         <pic:nvPicPr>
-                          <pic:cNvPr descr="C:\Program Files\RStudio\resources\app\bin\quarto\share\formats\docx\note.png" id="86" name="Picture"/>
+                          <pic:cNvPr descr="C:\PROGRA~1\RStudio\RESOUR~1\app\bin\quarto\share\formats\docx\note.png" id="86" name="Picture"/>
                           <pic:cNvPicPr>
                             <a:picLocks noChangeArrowheads="1" noChangeAspect="1"/>
                           </pic:cNvPicPr>

</xml_diff>